<commit_message>
Reframe training doc for receiving pharmacy + swap email training session for video link
</commit_message>
<xml_diff>
--- a/PI-Transfer-Tracker-Welcome-Email.docx
+++ b/PI-Transfer-Tracker-Welcome-Email.docx
@@ -5,7 +5,7 @@
     <w:p>
       <w:pPr>
         <w:shd w:val="clear" w:color="auto" w:fill="F1F5F9"/>
-        <w:divId w:val="813334215"/>
+        <w:divId w:val="2104379993"/>
         <w:rPr>
           <w:rFonts w:ascii="Segoe UI" w:eastAsia="Times New Roman" w:hAnsi="Segoe UI" w:cs="Segoe UI"/>
           <w:color w:val="0F172A"/>
@@ -205,7 +205,70 @@
           <w:szCs w:val="21"/>
           <w:lang w:val="en"/>
         </w:rPr>
-        <w:t xml:space="preserve"> portal — the same system the other PI pharmacies use to send prescriptions between stores, ship compounds from Erie, and track pickup orders. Excited to have you on it.</w:t>
+        <w:t xml:space="preserve"> portal — the same system the other PI pharmacies use to move prescriptions between stores. For your team, this mostly means </w:t>
+      </w:r>
+      <w:r>
+        <w:rPr>
+          <w:rStyle w:val="Strong"/>
+          <w:rFonts w:ascii="Segoe UI" w:hAnsi="Segoe UI" w:cs="Segoe UI"/>
+          <w:color w:val="0F172A"/>
+          <w:sz w:val="21"/>
+          <w:szCs w:val="21"/>
+          <w:lang w:val="en"/>
+        </w:rPr>
+        <w:t>receiving shipments</w:t>
+      </w:r>
+      <w:r>
+        <w:rPr>
+          <w:rFonts w:ascii="Segoe UI" w:hAnsi="Segoe UI" w:cs="Segoe UI"/>
+          <w:color w:val="0F172A"/>
+          <w:sz w:val="21"/>
+          <w:szCs w:val="21"/>
+          <w:lang w:val="en"/>
+        </w:rPr>
+        <w:t xml:space="preserve"> from Erie (compounds) and other PI stores, </w:t>
+      </w:r>
+      <w:r>
+        <w:rPr>
+          <w:rStyle w:val="Strong"/>
+          <w:rFonts w:ascii="Segoe UI" w:hAnsi="Segoe UI" w:cs="Segoe UI"/>
+          <w:color w:val="0F172A"/>
+          <w:sz w:val="21"/>
+          <w:szCs w:val="21"/>
+          <w:lang w:val="en"/>
+        </w:rPr>
+        <w:t>processing refills</w:t>
+      </w:r>
+      <w:r>
+        <w:rPr>
+          <w:rFonts w:ascii="Segoe UI" w:hAnsi="Segoe UI" w:cs="Segoe UI"/>
+          <w:color w:val="0F172A"/>
+          <w:sz w:val="21"/>
+          <w:szCs w:val="21"/>
+          <w:lang w:val="en"/>
+        </w:rPr>
+        <w:t xml:space="preserve"> on transfers originally set up by another location, and </w:t>
+      </w:r>
+      <w:r>
+        <w:rPr>
+          <w:rStyle w:val="Strong"/>
+          <w:rFonts w:ascii="Segoe UI" w:hAnsi="Segoe UI" w:cs="Segoe UI"/>
+          <w:color w:val="0F172A"/>
+          <w:sz w:val="21"/>
+          <w:szCs w:val="21"/>
+          <w:lang w:val="en"/>
+        </w:rPr>
+        <w:t>handing off prepared prescriptions</w:t>
+      </w:r>
+      <w:r>
+        <w:rPr>
+          <w:rFonts w:ascii="Segoe UI" w:hAnsi="Segoe UI" w:cs="Segoe UI"/>
+          <w:color w:val="0F172A"/>
+          <w:sz w:val="21"/>
+          <w:szCs w:val="21"/>
+          <w:lang w:val="en"/>
+        </w:rPr>
+        <w:t xml:space="preserve"> to patients who come in for pickup. Excited to have you on it.</w:t>
       </w:r>
     </w:p>
     <w:p>
@@ -298,17 +361,7 @@
           <w:szCs w:val="21"/>
           <w:lang w:val="en"/>
         </w:rPr>
-        <w:t xml:space="preserve"> </w:t>
-      </w:r>
-      <w:r>
-        <w:rPr>
-          <w:rFonts w:ascii="Segoe UI" w:hAnsi="Segoe UI" w:cs="Segoe UI"/>
-          <w:color w:val="0F172A"/>
-          <w:sz w:val="21"/>
-          <w:szCs w:val="21"/>
-          <w:lang w:val="en"/>
-        </w:rPr>
-        <w:t>Microsoft 365 account (same one you use for Outlook / Teams)</w:t>
+        <w:t xml:space="preserve"> Microsoft 365 account (same one you use for Outlook / Teams)</w:t>
       </w:r>
     </w:p>
     <w:p>
@@ -398,7 +451,17 @@
           <w:szCs w:val="21"/>
           <w:lang w:val="en"/>
         </w:rPr>
-        <w:t xml:space="preserve"> from a PK Transfer Sheet PDF — just drop the sheet in, verify, submit</w:t>
+        <w:t xml:space="preserve"> </w:t>
+      </w:r>
+      <w:r>
+        <w:rPr>
+          <w:rFonts w:ascii="Segoe UI" w:eastAsia="Times New Roman" w:hAnsi="Segoe UI" w:cs="Segoe UI"/>
+          <w:color w:val="0F172A"/>
+          <w:sz w:val="21"/>
+          <w:szCs w:val="21"/>
+          <w:lang w:val="en"/>
+        </w:rPr>
+        <w:t>from a PK Transfer Sheet PDF — just drop the sheet in, verify, submit</w:t>
       </w:r>
     </w:p>
     <w:p>
@@ -619,28 +682,7 @@
           <w:szCs w:val="21"/>
           <w:lang w:val="en"/>
         </w:rPr>
-        <w:t xml:space="preserve">Skim the </w:t>
-      </w:r>
-      <w:r>
-        <w:rPr>
-          <w:rStyle w:val="Strong"/>
-          <w:rFonts w:ascii="Segoe UI" w:eastAsia="Times New Roman" w:hAnsi="Segoe UI" w:cs="Segoe UI"/>
-          <w:color w:val="0F172A"/>
-          <w:sz w:val="21"/>
-          <w:szCs w:val="21"/>
-          <w:lang w:val="en"/>
-        </w:rPr>
-        <w:t>Getting Started guide</w:t>
-      </w:r>
-      <w:r>
-        <w:rPr>
-          <w:rFonts w:ascii="Segoe UI" w:eastAsia="Times New Roman" w:hAnsi="Segoe UI" w:cs="Segoe UI"/>
-          <w:color w:val="0F172A"/>
-          <w:sz w:val="21"/>
-          <w:szCs w:val="21"/>
-          <w:lang w:val="en"/>
-        </w:rPr>
-        <w:t xml:space="preserve"> (attached) — 5-minute read covering the three most common tasks</w:t>
+        <w:t>Watch the training video (link below) — covers the four most common tasks for a receiving pharmacy</w:t>
       </w:r>
     </w:p>
     <w:p>
@@ -666,88 +708,112 @@
           <w:szCs w:val="21"/>
           <w:lang w:val="en"/>
         </w:rPr>
-        <w:t xml:space="preserve">Click </w:t>
+        <w:t xml:space="preserve">Skim the attached </w:t>
       </w:r>
       <w:r>
         <w:rPr>
           <w:rStyle w:val="Strong"/>
-          <w:rFonts w:ascii="Segoe UI Emoji" w:eastAsia="Times New Roman" w:hAnsi="Segoe UI Emoji" w:cs="Segoe UI Emoji"/>
-          <w:color w:val="0F172A"/>
-          <w:sz w:val="21"/>
-          <w:szCs w:val="21"/>
-          <w:lang w:val="en"/>
-        </w:rPr>
-        <w:t>📖</w:t>
-      </w:r>
+          <w:rFonts w:ascii="Segoe UI" w:eastAsia="Times New Roman" w:hAnsi="Segoe UI" w:cs="Segoe UI"/>
+          <w:color w:val="0F172A"/>
+          <w:sz w:val="21"/>
+          <w:szCs w:val="21"/>
+          <w:lang w:val="en"/>
+        </w:rPr>
+        <w:t>Getting Started guide</w:t>
+      </w:r>
+      <w:r>
+        <w:rPr>
+          <w:rFonts w:ascii="Segoe UI" w:eastAsia="Times New Roman" w:hAnsi="Segoe UI" w:cs="Segoe UI"/>
+          <w:color w:val="0F172A"/>
+          <w:sz w:val="21"/>
+          <w:szCs w:val="21"/>
+          <w:lang w:val="en"/>
+        </w:rPr>
+        <w:t xml:space="preserve"> and keep it handy for reference</w:t>
+      </w:r>
+    </w:p>
+    <w:p>
+      <w:pPr>
+        <w:pStyle w:val="Heading2"/>
+        <w:rPr>
+          <w:rFonts w:ascii="Segoe UI" w:eastAsia="Times New Roman" w:hAnsi="Segoe UI" w:cs="Segoe UI"/>
+          <w:lang w:val="en"/>
+        </w:rPr>
+      </w:pPr>
+      <w:r>
+        <w:rPr>
+          <w:rFonts w:ascii="Segoe UI" w:eastAsia="Times New Roman" w:hAnsi="Segoe UI" w:cs="Segoe UI"/>
+          <w:lang w:val="en"/>
+        </w:rPr>
+        <w:t>Training video</w:t>
+      </w:r>
+    </w:p>
+    <w:p>
+      <w:pPr>
+        <w:pStyle w:val="NormalWeb"/>
+        <w:rPr>
+          <w:rFonts w:ascii="Segoe UI" w:hAnsi="Segoe UI" w:cs="Segoe UI"/>
+          <w:color w:val="0F172A"/>
+          <w:sz w:val="21"/>
+          <w:szCs w:val="21"/>
+          <w:lang w:val="en"/>
+        </w:rPr>
+      </w:pPr>
+      <w:r>
+        <w:rPr>
+          <w:rFonts w:ascii="Segoe UI" w:hAnsi="Segoe UI" w:cs="Segoe UI"/>
+          <w:color w:val="0F172A"/>
+          <w:sz w:val="21"/>
+          <w:szCs w:val="21"/>
+          <w:lang w:val="en"/>
+        </w:rPr>
+        <w:t>Rather than a live session, please have everyone watch the training walkthrough at your own pace:</w:t>
+      </w:r>
+    </w:p>
+    <w:p>
+      <w:pPr>
+        <w:pStyle w:val="NormalWeb"/>
+        <w:rPr>
+          <w:rFonts w:ascii="Segoe UI" w:hAnsi="Segoe UI" w:cs="Segoe UI"/>
+          <w:color w:val="0F172A"/>
+          <w:sz w:val="21"/>
+          <w:szCs w:val="21"/>
+          <w:lang w:val="en"/>
+        </w:rPr>
+      </w:pPr>
       <w:r>
         <w:rPr>
           <w:rStyle w:val="Strong"/>
-          <w:rFonts w:ascii="Segoe UI" w:eastAsia="Times New Roman" w:hAnsi="Segoe UI" w:cs="Segoe UI"/>
-          <w:color w:val="0F172A"/>
-          <w:sz w:val="21"/>
-          <w:szCs w:val="21"/>
-          <w:lang w:val="en"/>
-        </w:rPr>
-        <w:t xml:space="preserve"> Help</w:t>
-      </w:r>
-      <w:r>
-        <w:rPr>
-          <w:rFonts w:ascii="Segoe UI" w:eastAsia="Times New Roman" w:hAnsi="Segoe UI" w:cs="Segoe UI"/>
-          <w:color w:val="0F172A"/>
-          <w:sz w:val="21"/>
-          <w:szCs w:val="21"/>
-          <w:lang w:val="en"/>
-        </w:rPr>
-        <w:t xml:space="preserve"> in the top navbar and glance at the </w:t>
-      </w:r>
-      <w:r>
-        <w:rPr>
-          <w:rStyle w:val="Strong"/>
-          <w:rFonts w:ascii="Segoe UI Emoji" w:eastAsia="Times New Roman" w:hAnsi="Segoe UI Emoji" w:cs="Segoe UI Emoji"/>
-          <w:color w:val="0F172A"/>
-          <w:sz w:val="21"/>
-          <w:szCs w:val="21"/>
-          <w:lang w:val="en"/>
-        </w:rPr>
-        <w:t>🆕</w:t>
-      </w:r>
-      <w:r>
-        <w:rPr>
-          <w:rStyle w:val="Strong"/>
-          <w:rFonts w:ascii="Segoe UI" w:eastAsia="Times New Roman" w:hAnsi="Segoe UI" w:cs="Segoe UI"/>
-          <w:color w:val="0F172A"/>
-          <w:sz w:val="21"/>
-          <w:szCs w:val="21"/>
-          <w:lang w:val="en"/>
-        </w:rPr>
-        <w:t xml:space="preserve"> What's New (August 2026)</w:t>
-      </w:r>
-      <w:r>
-        <w:rPr>
-          <w:rFonts w:ascii="Segoe UI" w:eastAsia="Times New Roman" w:hAnsi="Segoe UI" w:cs="Segoe UI"/>
-          <w:color w:val="0F172A"/>
-          <w:sz w:val="21"/>
-          <w:szCs w:val="21"/>
-          <w:lang w:val="en"/>
-        </w:rPr>
-        <w:t xml:space="preserve"> section</w:t>
-      </w:r>
-    </w:p>
-    <w:p>
-      <w:pPr>
-        <w:pStyle w:val="Heading2"/>
-        <w:rPr>
-          <w:rFonts w:ascii="Segoe UI" w:eastAsia="Times New Roman" w:hAnsi="Segoe UI" w:cs="Segoe UI"/>
-          <w:lang w:val="en"/>
-        </w:rPr>
-      </w:pPr>
-      <w:r>
-        <w:rPr>
-          <w:rFonts w:ascii="Segoe UI" w:eastAsia="Times New Roman" w:hAnsi="Segoe UI" w:cs="Segoe UI"/>
-          <w:lang w:val="en"/>
-        </w:rPr>
-        <w:t>Training session</w:t>
-      </w:r>
+          <w:rFonts w:ascii="Segoe UI" w:hAnsi="Segoe UI" w:cs="Segoe UI"/>
+          <w:color w:val="0F172A"/>
+          <w:sz w:val="21"/>
+          <w:szCs w:val="21"/>
+          <w:lang w:val="en"/>
+        </w:rPr>
+        <w:t>Video:</w:t>
+      </w:r>
+      <w:r>
+        <w:rPr>
+          <w:rFonts w:ascii="Segoe UI" w:hAnsi="Segoe UI" w:cs="Segoe UI"/>
+          <w:color w:val="0F172A"/>
+          <w:sz w:val="21"/>
+          <w:szCs w:val="21"/>
+          <w:lang w:val="en"/>
+        </w:rPr>
+        <w:t xml:space="preserve"> </w:t>
+      </w:r>
+      <w:hyperlink r:id="rId5" w:history="1">
+        <w:r>
+          <w:rPr>
+            <w:rStyle w:val="Hyperlink"/>
+            <w:rFonts w:ascii="Segoe UI" w:hAnsi="Segoe UI" w:cs="Segoe UI"/>
+            <w:sz w:val="21"/>
+            <w:szCs w:val="21"/>
+            <w:lang w:val="en"/>
+          </w:rPr>
+          <w:t>[VIDEO LINK]</w:t>
+        </w:r>
+      </w:hyperlink>
     </w:p>
     <w:p>
       <w:pPr>
@@ -768,28 +834,7 @@
           <w:szCs w:val="21"/>
           <w:lang w:val="en"/>
         </w:rPr>
-        <w:t xml:space="preserve">I'll be running a live walkthrough on </w:t>
-      </w:r>
-      <w:r>
-        <w:rPr>
-          <w:rStyle w:val="Strong"/>
-          <w:rFonts w:ascii="Segoe UI" w:hAnsi="Segoe UI" w:cs="Segoe UI"/>
-          <w:color w:val="0F172A"/>
-          <w:sz w:val="21"/>
-          <w:szCs w:val="21"/>
-          <w:lang w:val="en"/>
-        </w:rPr>
-        <w:t>[TRAINING DATE / TIME]</w:t>
-      </w:r>
-      <w:r>
-        <w:rPr>
-          <w:rFonts w:ascii="Segoe UI" w:hAnsi="Segoe UI" w:cs="Segoe UI"/>
-          <w:color w:val="0F172A"/>
-          <w:sz w:val="21"/>
-          <w:szCs w:val="21"/>
-          <w:lang w:val="en"/>
-        </w:rPr>
-        <w:t xml:space="preserve"> — [in person at LOCATION / via Teams: link]. We'll go through:</w:t>
+        <w:t>The video covers:</w:t>
       </w:r>
     </w:p>
     <w:p>
@@ -841,7 +886,8 @@
           <w:szCs w:val="21"/>
           <w:lang w:val="en"/>
         </w:rPr>
-        <w:t>Creating a transfer (single + bulk upload)</w:t>
+        <w:lastRenderedPageBreak/>
+        <w:t>Receiving a shipment — normal case and partial-receive when scripts are missing</w:t>
       </w:r>
     </w:p>
     <w:p>
@@ -867,7 +913,7 @@
           <w:szCs w:val="21"/>
           <w:lang w:val="en"/>
         </w:rPr>
-        <w:t>Receiving a shipment (including partial-receive when scripts are missing)</w:t>
+        <w:t>Refilling an existing transfer (use + Refill, not + New Transfer)</w:t>
       </w:r>
     </w:p>
     <w:p>
@@ -893,7 +939,7 @@
           <w:szCs w:val="21"/>
           <w:lang w:val="en"/>
         </w:rPr>
-        <w:t>Asking a question and getting a Teams alert back</w:t>
+        <w:t>Handling non-transfer pickup orders (patient picks up a compound at your store)</w:t>
       </w:r>
     </w:p>
     <w:p>
@@ -919,7 +965,7 @@
           <w:szCs w:val="21"/>
           <w:lang w:val="en"/>
         </w:rPr>
-        <w:t>Where to find the Packing Checklist and how the FedEx auto-match works</w:t>
+        <w:t>Asking a question and where answers show up</w:t>
       </w:r>
     </w:p>
     <w:p>
@@ -941,8 +987,7 @@
           <w:szCs w:val="21"/>
           <w:lang w:val="en"/>
         </w:rPr>
-        <w:lastRenderedPageBreak/>
-        <w:t>Bring a laptop (or come to Erie's shipping station) so you can click through with me.</w:t>
+        <w:t>Watch it before your first shift on the portal. It's about the same length as a live walkthrough but you can rewind any part that's fuzzy, and new hires can watch it later without waiting on me to reschedule.</w:t>
       </w:r>
     </w:p>
     <w:p>
@@ -1215,17 +1260,7 @@
           <w:szCs w:val="21"/>
           <w:lang w:val="en"/>
         </w:rPr>
-        <w:t xml:space="preserve"> </w:t>
-      </w:r>
-      <w:r>
-        <w:rPr>
-          <w:rFonts w:ascii="Segoe UI" w:eastAsia="Times New Roman" w:hAnsi="Segoe UI" w:cs="Segoe UI"/>
-          <w:color w:val="0F172A"/>
-          <w:sz w:val="21"/>
-          <w:szCs w:val="21"/>
-          <w:lang w:val="en"/>
-        </w:rPr>
-        <w:t xml:space="preserve">— full reference, also available from the </w:t>
+        <w:t xml:space="preserve"> — full reference, also available from the </w:t>
       </w:r>
       <w:r>
         <w:rPr>
@@ -1316,9 +1351,9 @@
 <file path=word/numbering.xml><?xml version="1.0" encoding="utf-8"?>
 <w:numbering xmlns:wpc="http://schemas.microsoft.com/office/word/2010/wordprocessingCanvas" xmlns:cx="http://schemas.microsoft.com/office/drawing/2014/chartex" xmlns:cx1="http://schemas.microsoft.com/office/drawing/2015/9/8/chartex" xmlns:cx2="http://schemas.microsoft.com/office/drawing/2015/10/21/chartex" xmlns:cx3="http://schemas.microsoft.com/office/drawing/2016/5/9/chartex" xmlns:cx4="http://schemas.microsoft.com/office/drawing/2016/5/10/chartex" xmlns:cx5="http://schemas.microsoft.com/office/drawing/2016/5/11/chartex" xmlns:cx6="http://schemas.microsoft.com/office/drawing/2016/5/12/chartex" xmlns:cx7="http://schemas.microsoft.com/office/drawing/2016/5/13/chartex" xmlns:cx8="http://schemas.microsoft.com/office/drawing/2016/5/14/chartex" xmlns:mc="http://schemas.openxmlformats.org/markup-compatibility/2006" xmlns:aink="http://schemas.microsoft.com/office/drawing/2016/ink" xmlns:am3d="http://schemas.microsoft.com/office/drawing/2017/model3d" xmlns:o="urn:schemas-microsoft-com:office:office" xmlns:oel="http://schemas.microsoft.com/office/2019/extlst" xmlns:r="http://schemas.openxmlformats.org/officeDocument/2006/relationships" xmlns:m="http://schemas.openxmlformats.org/officeDocument/2006/math" xmlns:v="urn:schemas-microsoft-com:vml" xmlns:wp14="http://schemas.microsoft.com/office/word/2010/wordprocessingDrawing" xmlns:wp="http://schemas.openxmlformats.org/drawingml/2006/wordprocessingDrawing" xmlns:w10="urn:schemas-microsoft-com:office:word" xmlns:w="http://schemas.openxmlformats.org/wordprocessingml/2006/main" xmlns:w14="http://schemas.microsoft.com/office/word/2010/wordml" xmlns:w15="http://schemas.microsoft.com/office/word/2012/wordml" xmlns:w16cei="http://schemas.microsoft.com/office/word/2026/wordml/cei" xmlns:w16cex="http://schemas.microsoft.com/office/word/2018/wordml/cex" xmlns:w16cid="http://schemas.microsoft.com/office/word/2016/wordml/cid" xmlns:w16="http://schemas.microsoft.com/office/word/2018/wordml" xmlns:w16du="http://schemas.microsoft.com/office/word/2023/wordml/word16du" xmlns:w16sdtdh="http://schemas.microsoft.com/office/word/2020/wordml/sdtdatahash" xmlns:w16sdtfl="http://schemas.microsoft.com/office/word/2024/wordml/sdtformatlock" xmlns:w16se="http://schemas.microsoft.com/office/word/2015/wordml/symex" xmlns:wpg="http://schemas.microsoft.com/office/word/2010/wordprocessingGroup" xmlns:wpi="http://schemas.microsoft.com/office/word/2010/wordprocessingInk" xmlns:wne="http://schemas.microsoft.com/office/word/2006/wordml" xmlns:wps="http://schemas.microsoft.com/office/word/2010/wordprocessingShape" mc:Ignorable="w14 w15 w16se w16cid w16 w16cex w16sdtdh w16sdtfl w16du wp14">
   <w:abstractNum w:abstractNumId="0" w15:restartNumberingAfterBreak="0">
-    <w:nsid w:val="0CBE7B99"/>
+    <w:nsid w:val="19ED4256"/>
     <w:multiLevelType w:val="multilevel"/>
-    <w:tmpl w:val="C88AD2AE"/>
+    <w:tmpl w:val="2C401C40"/>
     <w:lvl w:ilvl="0">
       <w:start w:val="1"/>
       <w:numFmt w:val="bullet"/>
@@ -1465,9 +1500,307 @@
     </w:lvl>
   </w:abstractNum>
   <w:abstractNum w:abstractNumId="1" w15:restartNumberingAfterBreak="0">
-    <w:nsid w:val="1FF95877"/>
+    <w:nsid w:val="362D1A24"/>
     <w:multiLevelType w:val="multilevel"/>
-    <w:tmpl w:val="48929ED6"/>
+    <w:tmpl w:val="060EAB3A"/>
+    <w:lvl w:ilvl="0">
+      <w:start w:val="1"/>
+      <w:numFmt w:val="bullet"/>
+      <w:lvlText w:val=""/>
+      <w:lvlJc w:val="left"/>
+      <w:pPr>
+        <w:tabs>
+          <w:tab w:val="num" w:pos="720"/>
+        </w:tabs>
+        <w:ind w:left="720" w:hanging="360"/>
+      </w:pPr>
+      <w:rPr>
+        <w:rFonts w:ascii="Symbol" w:hAnsi="Symbol" w:hint="default"/>
+        <w:sz w:val="20"/>
+      </w:rPr>
+    </w:lvl>
+    <w:lvl w:ilvl="1" w:tentative="1">
+      <w:start w:val="1"/>
+      <w:numFmt w:val="bullet"/>
+      <w:lvlText w:val="o"/>
+      <w:lvlJc w:val="left"/>
+      <w:pPr>
+        <w:tabs>
+          <w:tab w:val="num" w:pos="1440"/>
+        </w:tabs>
+        <w:ind w:left="1440" w:hanging="360"/>
+      </w:pPr>
+      <w:rPr>
+        <w:rFonts w:ascii="Courier New" w:hAnsi="Courier New" w:hint="default"/>
+        <w:sz w:val="20"/>
+      </w:rPr>
+    </w:lvl>
+    <w:lvl w:ilvl="2" w:tentative="1">
+      <w:start w:val="1"/>
+      <w:numFmt w:val="bullet"/>
+      <w:lvlText w:val=""/>
+      <w:lvlJc w:val="left"/>
+      <w:pPr>
+        <w:tabs>
+          <w:tab w:val="num" w:pos="2160"/>
+        </w:tabs>
+        <w:ind w:left="2160" w:hanging="360"/>
+      </w:pPr>
+      <w:rPr>
+        <w:rFonts w:ascii="Wingdings" w:hAnsi="Wingdings" w:hint="default"/>
+        <w:sz w:val="20"/>
+      </w:rPr>
+    </w:lvl>
+    <w:lvl w:ilvl="3" w:tentative="1">
+      <w:start w:val="1"/>
+      <w:numFmt w:val="bullet"/>
+      <w:lvlText w:val=""/>
+      <w:lvlJc w:val="left"/>
+      <w:pPr>
+        <w:tabs>
+          <w:tab w:val="num" w:pos="2880"/>
+        </w:tabs>
+        <w:ind w:left="2880" w:hanging="360"/>
+      </w:pPr>
+      <w:rPr>
+        <w:rFonts w:ascii="Wingdings" w:hAnsi="Wingdings" w:hint="default"/>
+        <w:sz w:val="20"/>
+      </w:rPr>
+    </w:lvl>
+    <w:lvl w:ilvl="4" w:tentative="1">
+      <w:start w:val="1"/>
+      <w:numFmt w:val="bullet"/>
+      <w:lvlText w:val=""/>
+      <w:lvlJc w:val="left"/>
+      <w:pPr>
+        <w:tabs>
+          <w:tab w:val="num" w:pos="3600"/>
+        </w:tabs>
+        <w:ind w:left="3600" w:hanging="360"/>
+      </w:pPr>
+      <w:rPr>
+        <w:rFonts w:ascii="Wingdings" w:hAnsi="Wingdings" w:hint="default"/>
+        <w:sz w:val="20"/>
+      </w:rPr>
+    </w:lvl>
+    <w:lvl w:ilvl="5" w:tentative="1">
+      <w:start w:val="1"/>
+      <w:numFmt w:val="bullet"/>
+      <w:lvlText w:val=""/>
+      <w:lvlJc w:val="left"/>
+      <w:pPr>
+        <w:tabs>
+          <w:tab w:val="num" w:pos="4320"/>
+        </w:tabs>
+        <w:ind w:left="4320" w:hanging="360"/>
+      </w:pPr>
+      <w:rPr>
+        <w:rFonts w:ascii="Wingdings" w:hAnsi="Wingdings" w:hint="default"/>
+        <w:sz w:val="20"/>
+      </w:rPr>
+    </w:lvl>
+    <w:lvl w:ilvl="6" w:tentative="1">
+      <w:start w:val="1"/>
+      <w:numFmt w:val="bullet"/>
+      <w:lvlText w:val=""/>
+      <w:lvlJc w:val="left"/>
+      <w:pPr>
+        <w:tabs>
+          <w:tab w:val="num" w:pos="5040"/>
+        </w:tabs>
+        <w:ind w:left="5040" w:hanging="360"/>
+      </w:pPr>
+      <w:rPr>
+        <w:rFonts w:ascii="Wingdings" w:hAnsi="Wingdings" w:hint="default"/>
+        <w:sz w:val="20"/>
+      </w:rPr>
+    </w:lvl>
+    <w:lvl w:ilvl="7" w:tentative="1">
+      <w:start w:val="1"/>
+      <w:numFmt w:val="bullet"/>
+      <w:lvlText w:val=""/>
+      <w:lvlJc w:val="left"/>
+      <w:pPr>
+        <w:tabs>
+          <w:tab w:val="num" w:pos="5760"/>
+        </w:tabs>
+        <w:ind w:left="5760" w:hanging="360"/>
+      </w:pPr>
+      <w:rPr>
+        <w:rFonts w:ascii="Wingdings" w:hAnsi="Wingdings" w:hint="default"/>
+        <w:sz w:val="20"/>
+      </w:rPr>
+    </w:lvl>
+    <w:lvl w:ilvl="8" w:tentative="1">
+      <w:start w:val="1"/>
+      <w:numFmt w:val="bullet"/>
+      <w:lvlText w:val=""/>
+      <w:lvlJc w:val="left"/>
+      <w:pPr>
+        <w:tabs>
+          <w:tab w:val="num" w:pos="6480"/>
+        </w:tabs>
+        <w:ind w:left="6480" w:hanging="360"/>
+      </w:pPr>
+      <w:rPr>
+        <w:rFonts w:ascii="Wingdings" w:hAnsi="Wingdings" w:hint="default"/>
+        <w:sz w:val="20"/>
+      </w:rPr>
+    </w:lvl>
+  </w:abstractNum>
+  <w:abstractNum w:abstractNumId="2" w15:restartNumberingAfterBreak="0">
+    <w:nsid w:val="54C42B3D"/>
+    <w:multiLevelType w:val="multilevel"/>
+    <w:tmpl w:val="1508518A"/>
+    <w:lvl w:ilvl="0">
+      <w:start w:val="1"/>
+      <w:numFmt w:val="bullet"/>
+      <w:lvlText w:val=""/>
+      <w:lvlJc w:val="left"/>
+      <w:pPr>
+        <w:tabs>
+          <w:tab w:val="num" w:pos="720"/>
+        </w:tabs>
+        <w:ind w:left="720" w:hanging="360"/>
+      </w:pPr>
+      <w:rPr>
+        <w:rFonts w:ascii="Symbol" w:hAnsi="Symbol" w:hint="default"/>
+        <w:sz w:val="20"/>
+      </w:rPr>
+    </w:lvl>
+    <w:lvl w:ilvl="1" w:tentative="1">
+      <w:start w:val="1"/>
+      <w:numFmt w:val="bullet"/>
+      <w:lvlText w:val="o"/>
+      <w:lvlJc w:val="left"/>
+      <w:pPr>
+        <w:tabs>
+          <w:tab w:val="num" w:pos="1440"/>
+        </w:tabs>
+        <w:ind w:left="1440" w:hanging="360"/>
+      </w:pPr>
+      <w:rPr>
+        <w:rFonts w:ascii="Courier New" w:hAnsi="Courier New" w:hint="default"/>
+        <w:sz w:val="20"/>
+      </w:rPr>
+    </w:lvl>
+    <w:lvl w:ilvl="2" w:tentative="1">
+      <w:start w:val="1"/>
+      <w:numFmt w:val="bullet"/>
+      <w:lvlText w:val=""/>
+      <w:lvlJc w:val="left"/>
+      <w:pPr>
+        <w:tabs>
+          <w:tab w:val="num" w:pos="2160"/>
+        </w:tabs>
+        <w:ind w:left="2160" w:hanging="360"/>
+      </w:pPr>
+      <w:rPr>
+        <w:rFonts w:ascii="Wingdings" w:hAnsi="Wingdings" w:hint="default"/>
+        <w:sz w:val="20"/>
+      </w:rPr>
+    </w:lvl>
+    <w:lvl w:ilvl="3" w:tentative="1">
+      <w:start w:val="1"/>
+      <w:numFmt w:val="bullet"/>
+      <w:lvlText w:val=""/>
+      <w:lvlJc w:val="left"/>
+      <w:pPr>
+        <w:tabs>
+          <w:tab w:val="num" w:pos="2880"/>
+        </w:tabs>
+        <w:ind w:left="2880" w:hanging="360"/>
+      </w:pPr>
+      <w:rPr>
+        <w:rFonts w:ascii="Wingdings" w:hAnsi="Wingdings" w:hint="default"/>
+        <w:sz w:val="20"/>
+      </w:rPr>
+    </w:lvl>
+    <w:lvl w:ilvl="4" w:tentative="1">
+      <w:start w:val="1"/>
+      <w:numFmt w:val="bullet"/>
+      <w:lvlText w:val=""/>
+      <w:lvlJc w:val="left"/>
+      <w:pPr>
+        <w:tabs>
+          <w:tab w:val="num" w:pos="3600"/>
+        </w:tabs>
+        <w:ind w:left="3600" w:hanging="360"/>
+      </w:pPr>
+      <w:rPr>
+        <w:rFonts w:ascii="Wingdings" w:hAnsi="Wingdings" w:hint="default"/>
+        <w:sz w:val="20"/>
+      </w:rPr>
+    </w:lvl>
+    <w:lvl w:ilvl="5" w:tentative="1">
+      <w:start w:val="1"/>
+      <w:numFmt w:val="bullet"/>
+      <w:lvlText w:val=""/>
+      <w:lvlJc w:val="left"/>
+      <w:pPr>
+        <w:tabs>
+          <w:tab w:val="num" w:pos="4320"/>
+        </w:tabs>
+        <w:ind w:left="4320" w:hanging="360"/>
+      </w:pPr>
+      <w:rPr>
+        <w:rFonts w:ascii="Wingdings" w:hAnsi="Wingdings" w:hint="default"/>
+        <w:sz w:val="20"/>
+      </w:rPr>
+    </w:lvl>
+    <w:lvl w:ilvl="6" w:tentative="1">
+      <w:start w:val="1"/>
+      <w:numFmt w:val="bullet"/>
+      <w:lvlText w:val=""/>
+      <w:lvlJc w:val="left"/>
+      <w:pPr>
+        <w:tabs>
+          <w:tab w:val="num" w:pos="5040"/>
+        </w:tabs>
+        <w:ind w:left="5040" w:hanging="360"/>
+      </w:pPr>
+      <w:rPr>
+        <w:rFonts w:ascii="Wingdings" w:hAnsi="Wingdings" w:hint="default"/>
+        <w:sz w:val="20"/>
+      </w:rPr>
+    </w:lvl>
+    <w:lvl w:ilvl="7" w:tentative="1">
+      <w:start w:val="1"/>
+      <w:numFmt w:val="bullet"/>
+      <w:lvlText w:val=""/>
+      <w:lvlJc w:val="left"/>
+      <w:pPr>
+        <w:tabs>
+          <w:tab w:val="num" w:pos="5760"/>
+        </w:tabs>
+        <w:ind w:left="5760" w:hanging="360"/>
+      </w:pPr>
+      <w:rPr>
+        <w:rFonts w:ascii="Wingdings" w:hAnsi="Wingdings" w:hint="default"/>
+        <w:sz w:val="20"/>
+      </w:rPr>
+    </w:lvl>
+    <w:lvl w:ilvl="8" w:tentative="1">
+      <w:start w:val="1"/>
+      <w:numFmt w:val="bullet"/>
+      <w:lvlText w:val=""/>
+      <w:lvlJc w:val="left"/>
+      <w:pPr>
+        <w:tabs>
+          <w:tab w:val="num" w:pos="6480"/>
+        </w:tabs>
+        <w:ind w:left="6480" w:hanging="360"/>
+      </w:pPr>
+      <w:rPr>
+        <w:rFonts w:ascii="Wingdings" w:hAnsi="Wingdings" w:hint="default"/>
+        <w:sz w:val="20"/>
+      </w:rPr>
+    </w:lvl>
+  </w:abstractNum>
+  <w:abstractNum w:abstractNumId="3" w15:restartNumberingAfterBreak="0">
+    <w:nsid w:val="576D3333"/>
+    <w:multiLevelType w:val="multilevel"/>
+    <w:tmpl w:val="DB3C11D4"/>
     <w:lvl w:ilvl="0">
       <w:start w:val="1"/>
       <w:numFmt w:val="decimal"/>
@@ -1577,10 +1910,10 @@
       </w:pPr>
     </w:lvl>
   </w:abstractNum>
-  <w:abstractNum w:abstractNumId="2" w15:restartNumberingAfterBreak="0">
-    <w:nsid w:val="47A5441F"/>
+  <w:abstractNum w:abstractNumId="4" w15:restartNumberingAfterBreak="0">
+    <w:nsid w:val="602E09D2"/>
     <w:multiLevelType w:val="multilevel"/>
-    <w:tmpl w:val="5CA22436"/>
+    <w:tmpl w:val="DF766614"/>
     <w:lvl w:ilvl="0">
       <w:start w:val="1"/>
       <w:numFmt w:val="bullet"/>
@@ -1726,318 +2059,20 @@
       </w:rPr>
     </w:lvl>
   </w:abstractNum>
-  <w:abstractNum w:abstractNumId="3" w15:restartNumberingAfterBreak="0">
-    <w:nsid w:val="4A555954"/>
-    <w:multiLevelType w:val="multilevel"/>
-    <w:tmpl w:val="4DD422B2"/>
-    <w:lvl w:ilvl="0">
-      <w:start w:val="1"/>
-      <w:numFmt w:val="bullet"/>
-      <w:lvlText w:val=""/>
-      <w:lvlJc w:val="left"/>
-      <w:pPr>
-        <w:tabs>
-          <w:tab w:val="num" w:pos="720"/>
-        </w:tabs>
-        <w:ind w:left="720" w:hanging="360"/>
-      </w:pPr>
-      <w:rPr>
-        <w:rFonts w:ascii="Symbol" w:hAnsi="Symbol" w:hint="default"/>
-        <w:sz w:val="20"/>
-      </w:rPr>
-    </w:lvl>
-    <w:lvl w:ilvl="1" w:tentative="1">
-      <w:start w:val="1"/>
-      <w:numFmt w:val="bullet"/>
-      <w:lvlText w:val="o"/>
-      <w:lvlJc w:val="left"/>
-      <w:pPr>
-        <w:tabs>
-          <w:tab w:val="num" w:pos="1440"/>
-        </w:tabs>
-        <w:ind w:left="1440" w:hanging="360"/>
-      </w:pPr>
-      <w:rPr>
-        <w:rFonts w:ascii="Courier New" w:hAnsi="Courier New" w:hint="default"/>
-        <w:sz w:val="20"/>
-      </w:rPr>
-    </w:lvl>
-    <w:lvl w:ilvl="2" w:tentative="1">
-      <w:start w:val="1"/>
-      <w:numFmt w:val="bullet"/>
-      <w:lvlText w:val=""/>
-      <w:lvlJc w:val="left"/>
-      <w:pPr>
-        <w:tabs>
-          <w:tab w:val="num" w:pos="2160"/>
-        </w:tabs>
-        <w:ind w:left="2160" w:hanging="360"/>
-      </w:pPr>
-      <w:rPr>
-        <w:rFonts w:ascii="Wingdings" w:hAnsi="Wingdings" w:hint="default"/>
-        <w:sz w:val="20"/>
-      </w:rPr>
-    </w:lvl>
-    <w:lvl w:ilvl="3" w:tentative="1">
-      <w:start w:val="1"/>
-      <w:numFmt w:val="bullet"/>
-      <w:lvlText w:val=""/>
-      <w:lvlJc w:val="left"/>
-      <w:pPr>
-        <w:tabs>
-          <w:tab w:val="num" w:pos="2880"/>
-        </w:tabs>
-        <w:ind w:left="2880" w:hanging="360"/>
-      </w:pPr>
-      <w:rPr>
-        <w:rFonts w:ascii="Wingdings" w:hAnsi="Wingdings" w:hint="default"/>
-        <w:sz w:val="20"/>
-      </w:rPr>
-    </w:lvl>
-    <w:lvl w:ilvl="4" w:tentative="1">
-      <w:start w:val="1"/>
-      <w:numFmt w:val="bullet"/>
-      <w:lvlText w:val=""/>
-      <w:lvlJc w:val="left"/>
-      <w:pPr>
-        <w:tabs>
-          <w:tab w:val="num" w:pos="3600"/>
-        </w:tabs>
-        <w:ind w:left="3600" w:hanging="360"/>
-      </w:pPr>
-      <w:rPr>
-        <w:rFonts w:ascii="Wingdings" w:hAnsi="Wingdings" w:hint="default"/>
-        <w:sz w:val="20"/>
-      </w:rPr>
-    </w:lvl>
-    <w:lvl w:ilvl="5" w:tentative="1">
-      <w:start w:val="1"/>
-      <w:numFmt w:val="bullet"/>
-      <w:lvlText w:val=""/>
-      <w:lvlJc w:val="left"/>
-      <w:pPr>
-        <w:tabs>
-          <w:tab w:val="num" w:pos="4320"/>
-        </w:tabs>
-        <w:ind w:left="4320" w:hanging="360"/>
-      </w:pPr>
-      <w:rPr>
-        <w:rFonts w:ascii="Wingdings" w:hAnsi="Wingdings" w:hint="default"/>
-        <w:sz w:val="20"/>
-      </w:rPr>
-    </w:lvl>
-    <w:lvl w:ilvl="6" w:tentative="1">
-      <w:start w:val="1"/>
-      <w:numFmt w:val="bullet"/>
-      <w:lvlText w:val=""/>
-      <w:lvlJc w:val="left"/>
-      <w:pPr>
-        <w:tabs>
-          <w:tab w:val="num" w:pos="5040"/>
-        </w:tabs>
-        <w:ind w:left="5040" w:hanging="360"/>
-      </w:pPr>
-      <w:rPr>
-        <w:rFonts w:ascii="Wingdings" w:hAnsi="Wingdings" w:hint="default"/>
-        <w:sz w:val="20"/>
-      </w:rPr>
-    </w:lvl>
-    <w:lvl w:ilvl="7" w:tentative="1">
-      <w:start w:val="1"/>
-      <w:numFmt w:val="bullet"/>
-      <w:lvlText w:val=""/>
-      <w:lvlJc w:val="left"/>
-      <w:pPr>
-        <w:tabs>
-          <w:tab w:val="num" w:pos="5760"/>
-        </w:tabs>
-        <w:ind w:left="5760" w:hanging="360"/>
-      </w:pPr>
-      <w:rPr>
-        <w:rFonts w:ascii="Wingdings" w:hAnsi="Wingdings" w:hint="default"/>
-        <w:sz w:val="20"/>
-      </w:rPr>
-    </w:lvl>
-    <w:lvl w:ilvl="8" w:tentative="1">
-      <w:start w:val="1"/>
-      <w:numFmt w:val="bullet"/>
-      <w:lvlText w:val=""/>
-      <w:lvlJc w:val="left"/>
-      <w:pPr>
-        <w:tabs>
-          <w:tab w:val="num" w:pos="6480"/>
-        </w:tabs>
-        <w:ind w:left="6480" w:hanging="360"/>
-      </w:pPr>
-      <w:rPr>
-        <w:rFonts w:ascii="Wingdings" w:hAnsi="Wingdings" w:hint="default"/>
-        <w:sz w:val="20"/>
-      </w:rPr>
-    </w:lvl>
-  </w:abstractNum>
-  <w:abstractNum w:abstractNumId="4" w15:restartNumberingAfterBreak="0">
-    <w:nsid w:val="65EC5B02"/>
-    <w:multiLevelType w:val="multilevel"/>
-    <w:tmpl w:val="51129766"/>
-    <w:lvl w:ilvl="0">
-      <w:start w:val="1"/>
-      <w:numFmt w:val="bullet"/>
-      <w:lvlText w:val=""/>
-      <w:lvlJc w:val="left"/>
-      <w:pPr>
-        <w:tabs>
-          <w:tab w:val="num" w:pos="720"/>
-        </w:tabs>
-        <w:ind w:left="720" w:hanging="360"/>
-      </w:pPr>
-      <w:rPr>
-        <w:rFonts w:ascii="Symbol" w:hAnsi="Symbol" w:hint="default"/>
-        <w:sz w:val="20"/>
-      </w:rPr>
-    </w:lvl>
-    <w:lvl w:ilvl="1" w:tentative="1">
-      <w:start w:val="1"/>
-      <w:numFmt w:val="bullet"/>
-      <w:lvlText w:val="o"/>
-      <w:lvlJc w:val="left"/>
-      <w:pPr>
-        <w:tabs>
-          <w:tab w:val="num" w:pos="1440"/>
-        </w:tabs>
-        <w:ind w:left="1440" w:hanging="360"/>
-      </w:pPr>
-      <w:rPr>
-        <w:rFonts w:ascii="Courier New" w:hAnsi="Courier New" w:hint="default"/>
-        <w:sz w:val="20"/>
-      </w:rPr>
-    </w:lvl>
-    <w:lvl w:ilvl="2" w:tentative="1">
-      <w:start w:val="1"/>
-      <w:numFmt w:val="bullet"/>
-      <w:lvlText w:val=""/>
-      <w:lvlJc w:val="left"/>
-      <w:pPr>
-        <w:tabs>
-          <w:tab w:val="num" w:pos="2160"/>
-        </w:tabs>
-        <w:ind w:left="2160" w:hanging="360"/>
-      </w:pPr>
-      <w:rPr>
-        <w:rFonts w:ascii="Wingdings" w:hAnsi="Wingdings" w:hint="default"/>
-        <w:sz w:val="20"/>
-      </w:rPr>
-    </w:lvl>
-    <w:lvl w:ilvl="3" w:tentative="1">
-      <w:start w:val="1"/>
-      <w:numFmt w:val="bullet"/>
-      <w:lvlText w:val=""/>
-      <w:lvlJc w:val="left"/>
-      <w:pPr>
-        <w:tabs>
-          <w:tab w:val="num" w:pos="2880"/>
-        </w:tabs>
-        <w:ind w:left="2880" w:hanging="360"/>
-      </w:pPr>
-      <w:rPr>
-        <w:rFonts w:ascii="Wingdings" w:hAnsi="Wingdings" w:hint="default"/>
-        <w:sz w:val="20"/>
-      </w:rPr>
-    </w:lvl>
-    <w:lvl w:ilvl="4" w:tentative="1">
-      <w:start w:val="1"/>
-      <w:numFmt w:val="bullet"/>
-      <w:lvlText w:val=""/>
-      <w:lvlJc w:val="left"/>
-      <w:pPr>
-        <w:tabs>
-          <w:tab w:val="num" w:pos="3600"/>
-        </w:tabs>
-        <w:ind w:left="3600" w:hanging="360"/>
-      </w:pPr>
-      <w:rPr>
-        <w:rFonts w:ascii="Wingdings" w:hAnsi="Wingdings" w:hint="default"/>
-        <w:sz w:val="20"/>
-      </w:rPr>
-    </w:lvl>
-    <w:lvl w:ilvl="5" w:tentative="1">
-      <w:start w:val="1"/>
-      <w:numFmt w:val="bullet"/>
-      <w:lvlText w:val=""/>
-      <w:lvlJc w:val="left"/>
-      <w:pPr>
-        <w:tabs>
-          <w:tab w:val="num" w:pos="4320"/>
-        </w:tabs>
-        <w:ind w:left="4320" w:hanging="360"/>
-      </w:pPr>
-      <w:rPr>
-        <w:rFonts w:ascii="Wingdings" w:hAnsi="Wingdings" w:hint="default"/>
-        <w:sz w:val="20"/>
-      </w:rPr>
-    </w:lvl>
-    <w:lvl w:ilvl="6" w:tentative="1">
-      <w:start w:val="1"/>
-      <w:numFmt w:val="bullet"/>
-      <w:lvlText w:val=""/>
-      <w:lvlJc w:val="left"/>
-      <w:pPr>
-        <w:tabs>
-          <w:tab w:val="num" w:pos="5040"/>
-        </w:tabs>
-        <w:ind w:left="5040" w:hanging="360"/>
-      </w:pPr>
-      <w:rPr>
-        <w:rFonts w:ascii="Wingdings" w:hAnsi="Wingdings" w:hint="default"/>
-        <w:sz w:val="20"/>
-      </w:rPr>
-    </w:lvl>
-    <w:lvl w:ilvl="7" w:tentative="1">
-      <w:start w:val="1"/>
-      <w:numFmt w:val="bullet"/>
-      <w:lvlText w:val=""/>
-      <w:lvlJc w:val="left"/>
-      <w:pPr>
-        <w:tabs>
-          <w:tab w:val="num" w:pos="5760"/>
-        </w:tabs>
-        <w:ind w:left="5760" w:hanging="360"/>
-      </w:pPr>
-      <w:rPr>
-        <w:rFonts w:ascii="Wingdings" w:hAnsi="Wingdings" w:hint="default"/>
-        <w:sz w:val="20"/>
-      </w:rPr>
-    </w:lvl>
-    <w:lvl w:ilvl="8" w:tentative="1">
-      <w:start w:val="1"/>
-      <w:numFmt w:val="bullet"/>
-      <w:lvlText w:val=""/>
-      <w:lvlJc w:val="left"/>
-      <w:pPr>
-        <w:tabs>
-          <w:tab w:val="num" w:pos="6480"/>
-        </w:tabs>
-        <w:ind w:left="6480" w:hanging="360"/>
-      </w:pPr>
-      <w:rPr>
-        <w:rFonts w:ascii="Wingdings" w:hAnsi="Wingdings" w:hint="default"/>
-        <w:sz w:val="20"/>
-      </w:rPr>
-    </w:lvl>
-  </w:abstractNum>
-  <w:num w:numId="1" w16cid:durableId="653142606">
+  <w:num w:numId="1" w16cid:durableId="897134870">
+    <w:abstractNumId w:val="4"/>
+  </w:num>
+  <w:num w:numId="2" w16cid:durableId="491028146">
     <w:abstractNumId w:val="3"/>
   </w:num>
-  <w:num w:numId="2" w16cid:durableId="160972522">
+  <w:num w:numId="3" w16cid:durableId="886063375">
     <w:abstractNumId w:val="1"/>
   </w:num>
-  <w:num w:numId="3" w16cid:durableId="1527791956">
+  <w:num w:numId="4" w16cid:durableId="633946665">
+    <w:abstractNumId w:val="0"/>
+  </w:num>
+  <w:num w:numId="5" w16cid:durableId="1173641146">
     <w:abstractNumId w:val="2"/>
-  </w:num>
-  <w:num w:numId="4" w16cid:durableId="1258367288">
-    <w:abstractNumId w:val="4"/>
-  </w:num>
-  <w:num w:numId="5" w16cid:durableId="185606463">
-    <w:abstractNumId w:val="0"/>
   </w:num>
 </w:numbering>
 </file>
@@ -2596,6 +2631,28 @@
       <w:rFonts w:ascii="Consolas" w:hAnsi="Consolas" w:hint="default"/>
     </w:rPr>
   </w:style>
+  <w:style w:type="character" w:styleId="Hyperlink">
+    <w:name w:val="Hyperlink"/>
+    <w:basedOn w:val="DefaultParagraphFont"/>
+    <w:uiPriority w:val="99"/>
+    <w:semiHidden/>
+    <w:unhideWhenUsed/>
+    <w:rPr>
+      <w:color w:val="0000FF"/>
+      <w:u w:val="single"/>
+    </w:rPr>
+  </w:style>
+  <w:style w:type="character" w:styleId="FollowedHyperlink">
+    <w:name w:val="FollowedHyperlink"/>
+    <w:basedOn w:val="DefaultParagraphFont"/>
+    <w:uiPriority w:val="99"/>
+    <w:semiHidden/>
+    <w:unhideWhenUsed/>
+    <w:rPr>
+      <w:color w:val="800080"/>
+      <w:u w:val="single"/>
+    </w:rPr>
+  </w:style>
 </w:styles>
 </file>
 

</xml_diff>

<commit_message>
Wire real SharePoint training video link into welcome email
</commit_message>
<xml_diff>
--- a/PI-Transfer-Tracker-Welcome-Email.docx
+++ b/PI-Transfer-Tracker-Welcome-Email.docx
@@ -5,7 +5,7 @@
     <w:p>
       <w:pPr>
         <w:shd w:val="clear" w:color="auto" w:fill="F1F5F9"/>
-        <w:divId w:val="2104379993"/>
+        <w:divId w:val="1415471566"/>
         <w:rPr>
           <w:rFonts w:ascii="Segoe UI" w:eastAsia="Times New Roman" w:hAnsi="Segoe UI" w:cs="Segoe UI"/>
           <w:color w:val="0F172A"/>
@@ -811,7 +811,7 @@
             <w:szCs w:val="21"/>
             <w:lang w:val="en"/>
           </w:rPr>
-          <w:t>[VIDEO LINK]</w:t>
+          <w:t>Watch the PI Transfer Tracker training video</w:t>
         </w:r>
       </w:hyperlink>
     </w:p>
@@ -1164,7 +1164,17 @@
           <w:szCs w:val="21"/>
           <w:lang w:val="en"/>
         </w:rPr>
-        <w:t xml:space="preserve"> button inside the transfer — it routes straight to the correct pharmacy's Teams chat</w:t>
+        <w:t xml:space="preserve"> </w:t>
+      </w:r>
+      <w:r>
+        <w:rPr>
+          <w:rFonts w:ascii="Segoe UI" w:eastAsia="Times New Roman" w:hAnsi="Segoe UI" w:cs="Segoe UI"/>
+          <w:color w:val="0F172A"/>
+          <w:sz w:val="21"/>
+          <w:szCs w:val="21"/>
+          <w:lang w:val="en"/>
+        </w:rPr>
+        <w:t>button inside the transfer — it routes straight to the correct pharmacy's Teams chat</w:t>
       </w:r>
     </w:p>
     <w:p>
@@ -1351,13 +1361,13 @@
 <file path=word/numbering.xml><?xml version="1.0" encoding="utf-8"?>
 <w:numbering xmlns:wpc="http://schemas.microsoft.com/office/word/2010/wordprocessingCanvas" xmlns:cx="http://schemas.microsoft.com/office/drawing/2014/chartex" xmlns:cx1="http://schemas.microsoft.com/office/drawing/2015/9/8/chartex" xmlns:cx2="http://schemas.microsoft.com/office/drawing/2015/10/21/chartex" xmlns:cx3="http://schemas.microsoft.com/office/drawing/2016/5/9/chartex" xmlns:cx4="http://schemas.microsoft.com/office/drawing/2016/5/10/chartex" xmlns:cx5="http://schemas.microsoft.com/office/drawing/2016/5/11/chartex" xmlns:cx6="http://schemas.microsoft.com/office/drawing/2016/5/12/chartex" xmlns:cx7="http://schemas.microsoft.com/office/drawing/2016/5/13/chartex" xmlns:cx8="http://schemas.microsoft.com/office/drawing/2016/5/14/chartex" xmlns:mc="http://schemas.openxmlformats.org/markup-compatibility/2006" xmlns:aink="http://schemas.microsoft.com/office/drawing/2016/ink" xmlns:am3d="http://schemas.microsoft.com/office/drawing/2017/model3d" xmlns:o="urn:schemas-microsoft-com:office:office" xmlns:oel="http://schemas.microsoft.com/office/2019/extlst" xmlns:r="http://schemas.openxmlformats.org/officeDocument/2006/relationships" xmlns:m="http://schemas.openxmlformats.org/officeDocument/2006/math" xmlns:v="urn:schemas-microsoft-com:vml" xmlns:wp14="http://schemas.microsoft.com/office/word/2010/wordprocessingDrawing" xmlns:wp="http://schemas.openxmlformats.org/drawingml/2006/wordprocessingDrawing" xmlns:w10="urn:schemas-microsoft-com:office:word" xmlns:w="http://schemas.openxmlformats.org/wordprocessingml/2006/main" xmlns:w14="http://schemas.microsoft.com/office/word/2010/wordml" xmlns:w15="http://schemas.microsoft.com/office/word/2012/wordml" xmlns:w16cei="http://schemas.microsoft.com/office/word/2026/wordml/cei" xmlns:w16cex="http://schemas.microsoft.com/office/word/2018/wordml/cex" xmlns:w16cid="http://schemas.microsoft.com/office/word/2016/wordml/cid" xmlns:w16="http://schemas.microsoft.com/office/word/2018/wordml" xmlns:w16du="http://schemas.microsoft.com/office/word/2023/wordml/word16du" xmlns:w16sdtdh="http://schemas.microsoft.com/office/word/2020/wordml/sdtdatahash" xmlns:w16sdtfl="http://schemas.microsoft.com/office/word/2024/wordml/sdtformatlock" xmlns:w16se="http://schemas.microsoft.com/office/word/2015/wordml/symex" xmlns:wpg="http://schemas.microsoft.com/office/word/2010/wordprocessingGroup" xmlns:wpi="http://schemas.microsoft.com/office/word/2010/wordprocessingInk" xmlns:wne="http://schemas.microsoft.com/office/word/2006/wordml" xmlns:wps="http://schemas.microsoft.com/office/word/2010/wordprocessingShape" mc:Ignorable="w14 w15 w16se w16cid w16 w16cex w16sdtdh w16sdtfl w16du wp14">
   <w:abstractNum w:abstractNumId="0" w15:restartNumberingAfterBreak="0">
-    <w:nsid w:val="19ED4256"/>
+    <w:nsid w:val="2D79263D"/>
     <w:multiLevelType w:val="multilevel"/>
-    <w:tmpl w:val="2C401C40"/>
+    <w:tmpl w:val="4038F75C"/>
     <w:lvl w:ilvl="0">
       <w:start w:val="1"/>
-      <w:numFmt w:val="bullet"/>
-      <w:lvlText w:val=""/>
+      <w:numFmt w:val="decimal"/>
+      <w:lvlText w:val="%1."/>
       <w:lvlJc w:val="left"/>
       <w:pPr>
         <w:tabs>
@@ -1365,15 +1375,11 @@
         </w:tabs>
         <w:ind w:left="720" w:hanging="360"/>
       </w:pPr>
-      <w:rPr>
-        <w:rFonts w:ascii="Symbol" w:hAnsi="Symbol" w:hint="default"/>
-        <w:sz w:val="20"/>
-      </w:rPr>
     </w:lvl>
     <w:lvl w:ilvl="1" w:tentative="1">
       <w:start w:val="1"/>
-      <w:numFmt w:val="bullet"/>
-      <w:lvlText w:val="o"/>
+      <w:numFmt w:val="decimal"/>
+      <w:lvlText w:val="%2."/>
       <w:lvlJc w:val="left"/>
       <w:pPr>
         <w:tabs>
@@ -1381,15 +1387,11 @@
         </w:tabs>
         <w:ind w:left="1440" w:hanging="360"/>
       </w:pPr>
-      <w:rPr>
-        <w:rFonts w:ascii="Courier New" w:hAnsi="Courier New" w:hint="default"/>
-        <w:sz w:val="20"/>
-      </w:rPr>
     </w:lvl>
     <w:lvl w:ilvl="2" w:tentative="1">
       <w:start w:val="1"/>
-      <w:numFmt w:val="bullet"/>
-      <w:lvlText w:val=""/>
+      <w:numFmt w:val="decimal"/>
+      <w:lvlText w:val="%3."/>
       <w:lvlJc w:val="left"/>
       <w:pPr>
         <w:tabs>
@@ -1397,15 +1399,11 @@
         </w:tabs>
         <w:ind w:left="2160" w:hanging="360"/>
       </w:pPr>
-      <w:rPr>
-        <w:rFonts w:ascii="Wingdings" w:hAnsi="Wingdings" w:hint="default"/>
-        <w:sz w:val="20"/>
-      </w:rPr>
     </w:lvl>
     <w:lvl w:ilvl="3" w:tentative="1">
       <w:start w:val="1"/>
-      <w:numFmt w:val="bullet"/>
-      <w:lvlText w:val=""/>
+      <w:numFmt w:val="decimal"/>
+      <w:lvlText w:val="%4."/>
       <w:lvlJc w:val="left"/>
       <w:pPr>
         <w:tabs>
@@ -1413,15 +1411,11 @@
         </w:tabs>
         <w:ind w:left="2880" w:hanging="360"/>
       </w:pPr>
-      <w:rPr>
-        <w:rFonts w:ascii="Wingdings" w:hAnsi="Wingdings" w:hint="default"/>
-        <w:sz w:val="20"/>
-      </w:rPr>
     </w:lvl>
     <w:lvl w:ilvl="4" w:tentative="1">
       <w:start w:val="1"/>
-      <w:numFmt w:val="bullet"/>
-      <w:lvlText w:val=""/>
+      <w:numFmt w:val="decimal"/>
+      <w:lvlText w:val="%5."/>
       <w:lvlJc w:val="left"/>
       <w:pPr>
         <w:tabs>
@@ -1429,15 +1423,11 @@
         </w:tabs>
         <w:ind w:left="3600" w:hanging="360"/>
       </w:pPr>
-      <w:rPr>
-        <w:rFonts w:ascii="Wingdings" w:hAnsi="Wingdings" w:hint="default"/>
-        <w:sz w:val="20"/>
-      </w:rPr>
     </w:lvl>
     <w:lvl w:ilvl="5" w:tentative="1">
       <w:start w:val="1"/>
-      <w:numFmt w:val="bullet"/>
-      <w:lvlText w:val=""/>
+      <w:numFmt w:val="decimal"/>
+      <w:lvlText w:val="%6."/>
       <w:lvlJc w:val="left"/>
       <w:pPr>
         <w:tabs>
@@ -1445,15 +1435,11 @@
         </w:tabs>
         <w:ind w:left="4320" w:hanging="360"/>
       </w:pPr>
-      <w:rPr>
-        <w:rFonts w:ascii="Wingdings" w:hAnsi="Wingdings" w:hint="default"/>
-        <w:sz w:val="20"/>
-      </w:rPr>
     </w:lvl>
     <w:lvl w:ilvl="6" w:tentative="1">
       <w:start w:val="1"/>
-      <w:numFmt w:val="bullet"/>
-      <w:lvlText w:val=""/>
+      <w:numFmt w:val="decimal"/>
+      <w:lvlText w:val="%7."/>
       <w:lvlJc w:val="left"/>
       <w:pPr>
         <w:tabs>
@@ -1461,15 +1447,11 @@
         </w:tabs>
         <w:ind w:left="5040" w:hanging="360"/>
       </w:pPr>
-      <w:rPr>
-        <w:rFonts w:ascii="Wingdings" w:hAnsi="Wingdings" w:hint="default"/>
-        <w:sz w:val="20"/>
-      </w:rPr>
     </w:lvl>
     <w:lvl w:ilvl="7" w:tentative="1">
       <w:start w:val="1"/>
-      <w:numFmt w:val="bullet"/>
-      <w:lvlText w:val=""/>
+      <w:numFmt w:val="decimal"/>
+      <w:lvlText w:val="%8."/>
       <w:lvlJc w:val="left"/>
       <w:pPr>
         <w:tabs>
@@ -1477,15 +1459,11 @@
         </w:tabs>
         <w:ind w:left="5760" w:hanging="360"/>
       </w:pPr>
-      <w:rPr>
-        <w:rFonts w:ascii="Wingdings" w:hAnsi="Wingdings" w:hint="default"/>
-        <w:sz w:val="20"/>
-      </w:rPr>
     </w:lvl>
     <w:lvl w:ilvl="8" w:tentative="1">
       <w:start w:val="1"/>
-      <w:numFmt w:val="bullet"/>
-      <w:lvlText w:val=""/>
+      <w:numFmt w:val="decimal"/>
+      <w:lvlText w:val="%9."/>
       <w:lvlJc w:val="left"/>
       <w:pPr>
         <w:tabs>
@@ -1493,16 +1471,12 @@
         </w:tabs>
         <w:ind w:left="6480" w:hanging="360"/>
       </w:pPr>
-      <w:rPr>
-        <w:rFonts w:ascii="Wingdings" w:hAnsi="Wingdings" w:hint="default"/>
-        <w:sz w:val="20"/>
-      </w:rPr>
     </w:lvl>
   </w:abstractNum>
   <w:abstractNum w:abstractNumId="1" w15:restartNumberingAfterBreak="0">
-    <w:nsid w:val="362D1A24"/>
+    <w:nsid w:val="3DA40B1A"/>
     <w:multiLevelType w:val="multilevel"/>
-    <w:tmpl w:val="060EAB3A"/>
+    <w:tmpl w:val="078AB0D8"/>
     <w:lvl w:ilvl="0">
       <w:start w:val="1"/>
       <w:numFmt w:val="bullet"/>
@@ -1649,9 +1623,9 @@
     </w:lvl>
   </w:abstractNum>
   <w:abstractNum w:abstractNumId="2" w15:restartNumberingAfterBreak="0">
-    <w:nsid w:val="54C42B3D"/>
+    <w:nsid w:val="516C5C6C"/>
     <w:multiLevelType w:val="multilevel"/>
-    <w:tmpl w:val="1508518A"/>
+    <w:tmpl w:val="C0704056"/>
     <w:lvl w:ilvl="0">
       <w:start w:val="1"/>
       <w:numFmt w:val="bullet"/>
@@ -1798,13 +1772,13 @@
     </w:lvl>
   </w:abstractNum>
   <w:abstractNum w:abstractNumId="3" w15:restartNumberingAfterBreak="0">
-    <w:nsid w:val="576D3333"/>
+    <w:nsid w:val="53232A0D"/>
     <w:multiLevelType w:val="multilevel"/>
-    <w:tmpl w:val="DB3C11D4"/>
+    <w:tmpl w:val="4F4C776C"/>
     <w:lvl w:ilvl="0">
       <w:start w:val="1"/>
-      <w:numFmt w:val="decimal"/>
-      <w:lvlText w:val="%1."/>
+      <w:numFmt w:val="bullet"/>
+      <w:lvlText w:val=""/>
       <w:lvlJc w:val="left"/>
       <w:pPr>
         <w:tabs>
@@ -1812,11 +1786,15 @@
         </w:tabs>
         <w:ind w:left="720" w:hanging="360"/>
       </w:pPr>
+      <w:rPr>
+        <w:rFonts w:ascii="Symbol" w:hAnsi="Symbol" w:hint="default"/>
+        <w:sz w:val="20"/>
+      </w:rPr>
     </w:lvl>
     <w:lvl w:ilvl="1" w:tentative="1">
       <w:start w:val="1"/>
-      <w:numFmt w:val="decimal"/>
-      <w:lvlText w:val="%2."/>
+      <w:numFmt w:val="bullet"/>
+      <w:lvlText w:val="o"/>
       <w:lvlJc w:val="left"/>
       <w:pPr>
         <w:tabs>
@@ -1824,11 +1802,15 @@
         </w:tabs>
         <w:ind w:left="1440" w:hanging="360"/>
       </w:pPr>
+      <w:rPr>
+        <w:rFonts w:ascii="Courier New" w:hAnsi="Courier New" w:hint="default"/>
+        <w:sz w:val="20"/>
+      </w:rPr>
     </w:lvl>
     <w:lvl w:ilvl="2" w:tentative="1">
       <w:start w:val="1"/>
-      <w:numFmt w:val="decimal"/>
-      <w:lvlText w:val="%3."/>
+      <w:numFmt w:val="bullet"/>
+      <w:lvlText w:val=""/>
       <w:lvlJc w:val="left"/>
       <w:pPr>
         <w:tabs>
@@ -1836,11 +1818,15 @@
         </w:tabs>
         <w:ind w:left="2160" w:hanging="360"/>
       </w:pPr>
+      <w:rPr>
+        <w:rFonts w:ascii="Wingdings" w:hAnsi="Wingdings" w:hint="default"/>
+        <w:sz w:val="20"/>
+      </w:rPr>
     </w:lvl>
     <w:lvl w:ilvl="3" w:tentative="1">
       <w:start w:val="1"/>
-      <w:numFmt w:val="decimal"/>
-      <w:lvlText w:val="%4."/>
+      <w:numFmt w:val="bullet"/>
+      <w:lvlText w:val=""/>
       <w:lvlJc w:val="left"/>
       <w:pPr>
         <w:tabs>
@@ -1848,11 +1834,15 @@
         </w:tabs>
         <w:ind w:left="2880" w:hanging="360"/>
       </w:pPr>
+      <w:rPr>
+        <w:rFonts w:ascii="Wingdings" w:hAnsi="Wingdings" w:hint="default"/>
+        <w:sz w:val="20"/>
+      </w:rPr>
     </w:lvl>
     <w:lvl w:ilvl="4" w:tentative="1">
       <w:start w:val="1"/>
-      <w:numFmt w:val="decimal"/>
-      <w:lvlText w:val="%5."/>
+      <w:numFmt w:val="bullet"/>
+      <w:lvlText w:val=""/>
       <w:lvlJc w:val="left"/>
       <w:pPr>
         <w:tabs>
@@ -1860,11 +1850,15 @@
         </w:tabs>
         <w:ind w:left="3600" w:hanging="360"/>
       </w:pPr>
+      <w:rPr>
+        <w:rFonts w:ascii="Wingdings" w:hAnsi="Wingdings" w:hint="default"/>
+        <w:sz w:val="20"/>
+      </w:rPr>
     </w:lvl>
     <w:lvl w:ilvl="5" w:tentative="1">
       <w:start w:val="1"/>
-      <w:numFmt w:val="decimal"/>
-      <w:lvlText w:val="%6."/>
+      <w:numFmt w:val="bullet"/>
+      <w:lvlText w:val=""/>
       <w:lvlJc w:val="left"/>
       <w:pPr>
         <w:tabs>
@@ -1872,11 +1866,15 @@
         </w:tabs>
         <w:ind w:left="4320" w:hanging="360"/>
       </w:pPr>
+      <w:rPr>
+        <w:rFonts w:ascii="Wingdings" w:hAnsi="Wingdings" w:hint="default"/>
+        <w:sz w:val="20"/>
+      </w:rPr>
     </w:lvl>
     <w:lvl w:ilvl="6" w:tentative="1">
       <w:start w:val="1"/>
-      <w:numFmt w:val="decimal"/>
-      <w:lvlText w:val="%7."/>
+      <w:numFmt w:val="bullet"/>
+      <w:lvlText w:val=""/>
       <w:lvlJc w:val="left"/>
       <w:pPr>
         <w:tabs>
@@ -1884,11 +1882,15 @@
         </w:tabs>
         <w:ind w:left="5040" w:hanging="360"/>
       </w:pPr>
+      <w:rPr>
+        <w:rFonts w:ascii="Wingdings" w:hAnsi="Wingdings" w:hint="default"/>
+        <w:sz w:val="20"/>
+      </w:rPr>
     </w:lvl>
     <w:lvl w:ilvl="7" w:tentative="1">
       <w:start w:val="1"/>
-      <w:numFmt w:val="decimal"/>
-      <w:lvlText w:val="%8."/>
+      <w:numFmt w:val="bullet"/>
+      <w:lvlText w:val=""/>
       <w:lvlJc w:val="left"/>
       <w:pPr>
         <w:tabs>
@@ -1896,11 +1898,15 @@
         </w:tabs>
         <w:ind w:left="5760" w:hanging="360"/>
       </w:pPr>
+      <w:rPr>
+        <w:rFonts w:ascii="Wingdings" w:hAnsi="Wingdings" w:hint="default"/>
+        <w:sz w:val="20"/>
+      </w:rPr>
     </w:lvl>
     <w:lvl w:ilvl="8" w:tentative="1">
       <w:start w:val="1"/>
-      <w:numFmt w:val="decimal"/>
-      <w:lvlText w:val="%9."/>
+      <w:numFmt w:val="bullet"/>
+      <w:lvlText w:val=""/>
       <w:lvlJc w:val="left"/>
       <w:pPr>
         <w:tabs>
@@ -1908,12 +1914,16 @@
         </w:tabs>
         <w:ind w:left="6480" w:hanging="360"/>
       </w:pPr>
+      <w:rPr>
+        <w:rFonts w:ascii="Wingdings" w:hAnsi="Wingdings" w:hint="default"/>
+        <w:sz w:val="20"/>
+      </w:rPr>
     </w:lvl>
   </w:abstractNum>
   <w:abstractNum w:abstractNumId="4" w15:restartNumberingAfterBreak="0">
-    <w:nsid w:val="602E09D2"/>
+    <w:nsid w:val="628733BF"/>
     <w:multiLevelType w:val="multilevel"/>
-    <w:tmpl w:val="DF766614"/>
+    <w:tmpl w:val="E4AC28CE"/>
     <w:lvl w:ilvl="0">
       <w:start w:val="1"/>
       <w:numFmt w:val="bullet"/>
@@ -2059,20 +2069,20 @@
       </w:rPr>
     </w:lvl>
   </w:abstractNum>
-  <w:num w:numId="1" w16cid:durableId="897134870">
+  <w:num w:numId="1" w16cid:durableId="2125880320">
+    <w:abstractNumId w:val="3"/>
+  </w:num>
+  <w:num w:numId="2" w16cid:durableId="605843518">
+    <w:abstractNumId w:val="0"/>
+  </w:num>
+  <w:num w:numId="3" w16cid:durableId="1241057062">
+    <w:abstractNumId w:val="2"/>
+  </w:num>
+  <w:num w:numId="4" w16cid:durableId="1634359826">
     <w:abstractNumId w:val="4"/>
   </w:num>
-  <w:num w:numId="2" w16cid:durableId="491028146">
-    <w:abstractNumId w:val="3"/>
-  </w:num>
-  <w:num w:numId="3" w16cid:durableId="886063375">
+  <w:num w:numId="5" w16cid:durableId="1689916130">
     <w:abstractNumId w:val="1"/>
-  </w:num>
-  <w:num w:numId="4" w16cid:durableId="633946665">
-    <w:abstractNumId w:val="0"/>
-  </w:num>
-  <w:num w:numId="5" w16cid:durableId="1173641146">
-    <w:abstractNumId w:val="2"/>
   </w:num>
 </w:numbering>
 </file>

</xml_diff>